<commit_message>
Deploying to gh-pages from @ Morrison-Lab/sds@449361cd46ba663d9ac6138fb6af57d9803e8af7 🚀
</commit_message>
<xml_diff>
--- a/mcmc-handout.docx
+++ b/mcmc-handout.docx
@@ -15,7 +15,7 @@
         <w:pStyle w:val="Date"/>
       </w:pPr>
       <w:r>
-        <w:t xml:space="preserve">Last modified: 2026-09-28 03:39:25 (PDT)</w:t>
+        <w:t xml:space="preserve">Last modified: 2026-09-28 05:16:55 (PDT)</w:t>
       </w:r>
     </w:p>
     <w:p>
@@ -4373,19 +4373,31 @@
         <w:pStyle w:val="FirstParagraph"/>
       </w:pPr>
       <w:r>
-        <w:t xml:space="preserve">Under mild conditions on its transition probabilities,</w:t>
-      </w:r>
-      <w:r>
-        <w:t xml:space="preserve"> </w:t>
-      </w:r>
-      <w:r>
-        <w:t xml:space="preserve">a Markov chain has a unique stationary distribution,</w:t>
-      </w:r>
-      <w:r>
-        <w:t xml:space="preserve"> </w:t>
-      </w:r>
-      <w:r>
-        <w:t xml:space="preserve">the distribution of</w:t>
+        <w:t xml:space="preserve">Under conditions on its transition probabilities</w:t>
+      </w:r>
+      <w:r>
+        <w:t xml:space="preserve"> </w:t>
+      </w:r>
+      <w:r>
+        <w:t xml:space="preserve">(irreducibility, aperiodicity and positive recurrence;</w:t>
+      </w:r>
+      <w:r>
+        <w:t xml:space="preserve"> </w:t>
+      </w:r>
+      <w:r>
+        <w:t xml:space="preserve">for a continuous parameter, Harris positive recurrence),</w:t>
+      </w:r>
+      <w:r>
+        <w:t xml:space="preserve"> </w:t>
+      </w:r>
+      <w:r>
+        <w:t xml:space="preserve">a Markov chain has a unique stationary distribution</w:t>
+      </w:r>
+      <w:r>
+        <w:t xml:space="preserve"> </w:t>
+      </w:r>
+      <w:r>
+        <w:t xml:space="preserve">and the distribution of</w:t>
       </w:r>
       <w:r>
         <w:t xml:space="preserve"> </w:t>
@@ -4427,19 +4439,37 @@
         <w:t xml:space="preserve"> </w:t>
       </w:r>
       <w:r>
-        <w:t xml:space="preserve">converges to it,</w:t>
-      </w:r>
-      <w:r>
-        <w:t xml:space="preserve"> </w:t>
-      </w:r>
-      <w:r>
-        <w:t xml:space="preserve">and averages along the chain converge to expectations under it,</w:t>
-      </w:r>
-      <w:r>
-        <w:t xml:space="preserve"> </w:t>
-      </w:r>
-      <w:r>
-        <w:t xml:space="preserve">even though successive values are correlated.</w:t>
+        <w:t xml:space="preserve">converges to it</w:t>
+      </w:r>
+      <w:r>
+        <w:t xml:space="preserve"> </w:t>
+      </w:r>
+      <w:r>
+        <w:t xml:space="preserve">(Gelman et al. 2013, sec. 11.2, p. 279; Robert and Casella 2004, sec. 6.6.1, Theorem 6.51, p. 234)</w:t>
+      </w:r>
+      <w:r>
+        <w:t xml:space="preserve">.</w:t>
+      </w:r>
+      <w:r>
+        <w:t xml:space="preserve"> </w:t>
+      </w:r>
+      <w:r>
+        <w:t xml:space="preserve">Averages along the chain also converge to expectations under that distribution,</w:t>
+      </w:r>
+      <w:r>
+        <w:t xml:space="preserve"> </w:t>
+      </w:r>
+      <w:r>
+        <w:t xml:space="preserve">even though successive values are correlated</w:t>
+      </w:r>
+      <w:r>
+        <w:t xml:space="preserve"> </w:t>
+      </w:r>
+      <w:r>
+        <w:t xml:space="preserve">(Robert and Casella 2004, sec. 6.7.1, Theorem 6.63, p. 241; Robert and Casella 2004, sec. 7.2, p. 269)</w:t>
+      </w:r>
+      <w:r>
+        <w:t xml:space="preserve">.</w:t>
       </w:r>
       <w:r>
         <w:t xml:space="preserve"> </w:t>
@@ -4502,6 +4532,12 @@
           <m:t>)</m:t>
         </m:r>
       </m:oMath>
+      <w:r>
+        <w:t xml:space="preserve"> </w:t>
+      </w:r>
+      <w:r>
+        <w:t xml:space="preserve">(Gelman et al. 2013, chap. 11, p. 275)</w:t>
+      </w:r>
       <w:r>
         <w:t xml:space="preserve">,</w:t>
       </w:r>
@@ -7411,7 +7447,13 @@
         <w:t xml:space="preserve"> </w:t>
       </w:r>
       <w:r>
-        <w:t xml:space="preserve">The resulting chain is a</w:t>
+        <w:t xml:space="preserve">Provided the proposal can reach every region where the posterior is positive,</w:t>
+      </w:r>
+      <w:r>
+        <w:t xml:space="preserve"> </w:t>
+      </w:r>
+      <w:r>
+        <w:t xml:space="preserve">the resulting chain is a</w:t>
       </w:r>
       <w:r>
         <w:t xml:space="preserve"> </w:t>
@@ -7428,7 +7470,16 @@
         <w:t xml:space="preserve"> </w:t>
       </w:r>
       <w:r>
-        <w:t xml:space="preserve">whose stationary distribution is the posterior.</w:t>
+        <w:t xml:space="preserve">whose stationary distribution is the posterior</w:t>
+      </w:r>
+      <w:r>
+        <w:t xml:space="preserve"> </w:t>
+      </w:r>
+      <w:r>
+        <w:t xml:space="preserve">(Gelman et al. 2013, sec. 11.2, pp. 279-280; Robert and Casella 2004, sec. 7.3.1, Theorem 7.2, p. 272)</w:t>
+      </w:r>
+      <w:r>
+        <w:t xml:space="preserve">.</w:t>
       </w:r>
     </w:p>
     <w:bookmarkStart w:id="30" w:name="exm-mh-bernoulli"/>
@@ -14129,6 +14180,33 @@
         <w:t xml:space="preserve"> </w:t>
       </w:r>
       <m:oMath>
+        <m:acc>
+          <m:accPr>
+            <m:chr m:val="̂"/>
+          </m:accPr>
+          <m:e>
+            <m:r>
+              <m:t>V</m:t>
+            </m:r>
+          </m:e>
+        </m:acc>
+      </m:oMath>
+      <w:r>
+        <w:t xml:space="preserve"> </w:t>
+      </w:r>
+      <w:r>
+        <w:t xml:space="preserve">estimates the posterior variance</w:t>
+      </w:r>
+      <w:r>
+        <w:t xml:space="preserve"> </w:t>
+      </w:r>
+      <w:r>
+        <w:t xml:space="preserve">and</w:t>
+      </w:r>
+      <w:r>
+        <w:t xml:space="preserve"> </w:t>
+      </w:r>
+      <m:oMath>
         <m:r>
           <m:t>W</m:t>
         </m:r>
@@ -14137,7 +14215,27 @@
         <w:t xml:space="preserve"> </w:t>
       </w:r>
       <w:r>
-        <w:t xml:space="preserve">and</w:t>
+        <w:t xml:space="preserve">approaches it as</w:t>
+      </w:r>
+      <w:r>
+        <w:t xml:space="preserve"> </w:t>
+      </w:r>
+      <m:oMath>
+        <m:r>
+          <m:t>n</m:t>
+        </m:r>
+      </m:oMath>
+      <w:r>
+        <w:t xml:space="preserve"> </w:t>
+      </w:r>
+      <w:r>
+        <w:t xml:space="preserve">grows,</w:t>
+      </w:r>
+      <w:r>
+        <w:t xml:space="preserve"> </w:t>
+      </w:r>
+      <w:r>
+        <w:t xml:space="preserve">so</w:t>
       </w:r>
       <w:r>
         <w:t xml:space="preserve"> </w:t>
@@ -14149,7 +14247,7 @@
           </m:accPr>
           <m:e>
             <m:r>
-              <m:t>V</m:t>
+              <m:t>R</m:t>
             </m:r>
           </m:e>
         </m:acc>
@@ -14158,7 +14256,33 @@
         <w:t xml:space="preserve"> </w:t>
       </w:r>
       <w:r>
-        <w:t xml:space="preserve">both estimate the posterior variance,</w:t>
+        <w:t xml:space="preserve">is close to 1.</w:t>
+      </w:r>
+      <w:r>
+        <w:t xml:space="preserve"> </w:t>
+      </w:r>
+      <w:r>
+        <w:t xml:space="preserve">If the chains are still exploring different regions,</w:t>
+      </w:r>
+      <w:r>
+        <w:t xml:space="preserve"> </w:t>
+      </w:r>
+      <w:r>
+        <w:t xml:space="preserve">the chain means differ,</w:t>
+      </w:r>
+      <w:r>
+        <w:t xml:space="preserve"> </w:t>
+      </w:r>
+      <m:oMath>
+        <m:r>
+          <m:t>B</m:t>
+        </m:r>
+      </m:oMath>
+      <w:r>
+        <w:t xml:space="preserve"> </w:t>
+      </w:r>
+      <w:r>
+        <w:t xml:space="preserve">is large,</w:t>
       </w:r>
       <w:r>
         <w:t xml:space="preserve"> </w:t>
@@ -14185,39 +14309,54 @@
         <w:t xml:space="preserve"> </w:t>
       </w:r>
       <w:r>
-        <w:t xml:space="preserve">is close to 1.</w:t>
-      </w:r>
-      <w:r>
-        <w:t xml:space="preserve"> </w:t>
-      </w:r>
-      <w:r>
-        <w:t xml:space="preserve">If the chains are still exploring different regions,</w:t>
-      </w:r>
-      <w:r>
-        <w:t xml:space="preserve"> </w:t>
-      </w:r>
-      <w:r>
-        <w:t xml:space="preserve">the chain means differ,</w:t>
-      </w:r>
-      <w:r>
-        <w:t xml:space="preserve"> </w:t>
-      </w:r>
-      <m:oMath>
-        <m:r>
-          <m:t>B</m:t>
-        </m:r>
-      </m:oMath>
-      <w:r>
-        <w:t xml:space="preserve"> </w:t>
-      </w:r>
-      <w:r>
-        <w:t xml:space="preserve">is large,</w:t>
-      </w:r>
-      <w:r>
-        <w:t xml:space="preserve"> </w:t>
-      </w:r>
-      <w:r>
-        <w:t xml:space="preserve">and</w:t>
+        <w:t xml:space="preserve">exceeds 1</w:t>
+      </w:r>
+      <w:r>
+        <w:t xml:space="preserve"> </w:t>
+      </w:r>
+      <w:r>
+        <w:t xml:space="preserve">(Gelman et al. 2013, sec. 11.4, pp. 283-285)</w:t>
+      </w:r>
+      <w:r>
+        <w:t xml:space="preserve">.</w:t>
+      </w:r>
+      <w:r>
+        <w:t xml:space="preserve"> </w:t>
+      </w:r>
+      <w:hyperlink w:anchor="def-psrf">
+        <w:r>
+          <w:rPr>
+            <w:rStyle w:val="Hyperlink"/>
+          </w:rPr>
+          <w:t xml:space="preserve">Definition 13</w:t>
+        </w:r>
+      </w:hyperlink>
+      <w:r>
+        <w:t xml:space="preserve"> </w:t>
+      </w:r>
+      <w:r>
+        <w:t xml:space="preserve">follows</w:t>
+      </w:r>
+      <w:r>
+        <w:t xml:space="preserve"> </w:t>
+      </w:r>
+      <w:r>
+        <w:t xml:space="preserve">Gelman et al. (2013, sec. 11.4, pp. 284-285)</w:t>
+      </w:r>
+      <w:r>
+        <w:t xml:space="preserve">,</w:t>
+      </w:r>
+      <w:r>
+        <w:t xml:space="preserve"> </w:t>
+      </w:r>
+      <w:r>
+        <w:t xml:space="preserve">except that they first split each chain in half</w:t>
+      </w:r>
+      <w:r>
+        <w:t xml:space="preserve"> </w:t>
+      </w:r>
+      <w:r>
+        <w:t xml:space="preserve">and compute</w:t>
       </w:r>
       <w:r>
         <w:t xml:space="preserve"> </w:t>
@@ -14238,13 +14377,70 @@
         <w:t xml:space="preserve"> </w:t>
       </w:r>
       <w:r>
-        <w:t xml:space="preserve">exceeds 1.</w:t>
-      </w:r>
-      <w:r>
-        <w:t xml:space="preserve"> </w:t>
-      </w:r>
-      <w:r>
-        <w:t xml:space="preserve">This statistic is also called the</w:t>
+        <w:t xml:space="preserve">over the half-chains,</w:t>
+      </w:r>
+      <w:r>
+        <w:t xml:space="preserve"> </w:t>
+      </w:r>
+      <w:r>
+        <w:t xml:space="preserve">so that</w:t>
+      </w:r>
+      <w:r>
+        <w:t xml:space="preserve"> </w:t>
+      </w:r>
+      <m:oMath>
+        <m:acc>
+          <m:accPr>
+            <m:chr m:val="̂"/>
+          </m:accPr>
+          <m:e>
+            <m:r>
+              <m:t>R</m:t>
+            </m:r>
+          </m:e>
+        </m:acc>
+      </m:oMath>
+      <w:r>
+        <w:t xml:space="preserve"> </w:t>
+      </w:r>
+      <w:r>
+        <w:t xml:space="preserve">also checks each chain for stationarity</w:t>
+      </w:r>
+      <w:r>
+        <w:t xml:space="preserve"> </w:t>
+      </w:r>
+      <w:r>
+        <w:t xml:space="preserve">(Gelman et al. 2013, sec. 11.4, p. 285, footnote 2)</w:t>
+      </w:r>
+      <w:r>
+        <w:t xml:space="preserve">.</w:t>
+      </w:r>
+      <w:r>
+        <w:t xml:space="preserve"> </w:t>
+      </w:r>
+      <w:r>
+        <w:t xml:space="preserve">The statistic</w:t>
+      </w:r>
+      <w:r>
+        <w:t xml:space="preserve"> </w:t>
+      </w:r>
+      <m:oMath>
+        <m:acc>
+          <m:accPr>
+            <m:chr m:val="̂"/>
+          </m:accPr>
+          <m:e>
+            <m:r>
+              <m:t>R</m:t>
+            </m:r>
+          </m:e>
+        </m:acc>
+      </m:oMath>
+      <w:r>
+        <w:t xml:space="preserve"> </w:t>
+      </w:r>
+      <w:r>
+        <w:t xml:space="preserve">is also called the</w:t>
       </w:r>
       <w:r>
         <w:t xml:space="preserve"> </w:t>
@@ -19265,7 +19461,7 @@
       </w:r>
     </w:p>
     <w:bookmarkEnd w:id="58"/>
-    <w:bookmarkStart w:id="64" w:name="references"/>
+    <w:bookmarkStart w:id="68" w:name="references"/>
     <w:p>
       <w:pPr>
         <w:pStyle w:val="Heading2"/>
@@ -19274,7 +19470,7 @@
         <w:t xml:space="preserve">References</w:t>
       </w:r>
     </w:p>
-    <w:bookmarkStart w:id="63" w:name="refs"/>
+    <w:bookmarkStart w:id="67" w:name="refs"/>
     <w:bookmarkStart w:id="60" w:name="ref-CaseBerg01"/>
     <w:p>
       <w:pPr>
@@ -19349,8 +19545,82 @@
       </w:r>
     </w:p>
     <w:bookmarkEnd w:id="62"/>
-    <w:bookmarkEnd w:id="63"/>
+    <w:bookmarkStart w:id="64" w:name="ref-gelman2013bda"/>
+    <w:p>
+      <w:pPr>
+        <w:pStyle w:val="Bibliography"/>
+      </w:pPr>
+      <w:r>
+        <w:t xml:space="preserve">Gelman, Andrew, John B. Carlin, Hal S. Stern, David B. Dunson, Aki Vehtari, and Donald B. Rubin. 2013.</w:t>
+      </w:r>
+      <w:r>
+        <w:t xml:space="preserve"> </w:t>
+      </w:r>
+      <w:r>
+        <w:rPr>
+          <w:i/>
+          <w:iCs/>
+        </w:rPr>
+        <w:t xml:space="preserve">Bayesian Data Analysis</w:t>
+      </w:r>
+      <w:r>
+        <w:t xml:space="preserve">. 3rd ed. Chapman &amp; Hall/CRC Texts in Statistical Science. CRC Press.</w:t>
+      </w:r>
+      <w:r>
+        <w:t xml:space="preserve"> </w:t>
+      </w:r>
+      <w:hyperlink r:id="rId63">
+        <w:r>
+          <w:rPr>
+            <w:rStyle w:val="Hyperlink"/>
+          </w:rPr>
+          <w:t xml:space="preserve">https://doi.org/10.1201/b16018</w:t>
+        </w:r>
+      </w:hyperlink>
+      <w:r>
+        <w:t xml:space="preserve">.</w:t>
+      </w:r>
+    </w:p>
     <w:bookmarkEnd w:id="64"/>
+    <w:bookmarkStart w:id="66" w:name="ref-robert2004mcsm"/>
+    <w:p>
+      <w:pPr>
+        <w:pStyle w:val="Bibliography"/>
+      </w:pPr>
+      <w:r>
+        <w:t xml:space="preserve">Robert, Christian P., and George Casella. 2004.</w:t>
+      </w:r>
+      <w:r>
+        <w:t xml:space="preserve"> </w:t>
+      </w:r>
+      <w:r>
+        <w:rPr>
+          <w:i/>
+          <w:iCs/>
+        </w:rPr>
+        <w:t xml:space="preserve">Monte Carlo Statistical Methods</w:t>
+      </w:r>
+      <w:r>
+        <w:t xml:space="preserve">. 2nd ed. Springer Texts in Statistics. Springer.</w:t>
+      </w:r>
+      <w:r>
+        <w:t xml:space="preserve"> </w:t>
+      </w:r>
+      <w:hyperlink r:id="rId65">
+        <w:r>
+          <w:rPr>
+            <w:rStyle w:val="Hyperlink"/>
+          </w:rPr>
+          <w:t xml:space="preserve">https://doi.org/10.1007/978-1-4757-4145-2</w:t>
+        </w:r>
+      </w:hyperlink>
+      <w:r>
+        <w:t xml:space="preserve">.</w:t>
+      </w:r>
+    </w:p>
+    <w:bookmarkEnd w:id="66"/>
+    <w:bookmarkEnd w:id="67"/>
+    <w:bookmarkEnd w:id="68"/>
     <w:sectPr>
       <w:footnotePr>
         <w:numRestart w:val="eachSect"/>

</xml_diff>

<commit_message>
Deploying to gh-pages from @ Morrison-Lab/sds@86ea5c0c8dd16ae82d98d85e2539606b48497a29 🚀
</commit_message>
<xml_diff>
--- a/mcmc-handout.docx
+++ b/mcmc-handout.docx
@@ -15,7 +15,7 @@
         <w:pStyle w:val="Date"/>
       </w:pPr>
       <w:r>
-        <w:t xml:space="preserve">Last modified: 2026-10-16 11:26:47 (PDT)</w:t>
+        <w:t xml:space="preserve">Last modified: 2026-10-16 16:37:17 (PDT)</w:t>
       </w:r>
     </w:p>
     <w:p>
@@ -590,7 +590,7 @@
         <m:sSub>
           <m:e>
             <m:r>
-              <m:t>ε</m:t>
+              <m:t>ν</m:t>
             </m:r>
           </m:e>
           <m:sub>
@@ -616,7 +616,7 @@
         <m:sSub>
           <m:e>
             <m:r>
-              <m:t>ε</m:t>
+              <m:t>ν</m:t>
             </m:r>
           </m:e>
           <m:sub>

</xml_diff>